<commit_message>
Investiga a causa do plato de 2018 e reescreve projecao e conclusoes
</commit_message>
<xml_diff>
--- a/relatorios/relatorio_executivo_crescimento_receita.docx
+++ b/relatorios/relatorio_executivo_crescimento_receita.docx
@@ -94,6 +94,14 @@
       </w:pPr>
       <w:r>
         <w:t xml:space="preserve">O ponto mais importante desta análise, porém, é o que acontece depois desse crescimento. A partir de meados de 2018 a receita para de subir e passa a oscilar sempre no mesmo patamar. A média mensal do segundo quadrimestre de 2018 é até um pouco menor que a do primeiro. Ou seja, o número de 628% mostra o caminho que a empresa percorreu, mas não o momento em que ela está.</w:t>
+      </w:r>
+    </w:p>
+    <w:p>
+      <w:pPr>
+        <w:spacing w:after="160"/>
+      </w:pPr>
+      <w:r>
+        <w:t xml:space="preserve">Foi possível identificar de que lado veio esse limite. Ao longo de 2018 os vendedores ativos cresceram 30,8%, enquanto os clientes caíram 10% e a receita por vendedor encolheu 30,8%. A plataforma continuou atraindo quem vende, mas não quem compra, o que indica que o gargalo do crescimento está na demanda.</w:t>
       </w:r>
     </w:p>
     <w:p>
@@ -850,19 +858,19 @@
     </w:p>
     <w:p>
       <w:pPr>
-        <w:pStyle w:val="Heading1"/>
-        <w:spacing w:after="160" w:before="320"/>
-      </w:pPr>
-      <w:r>
-        <w:t xml:space="preserve">4. Projeção para os próximos meses</w:t>
-      </w:r>
-    </w:p>
-    <w:p>
-      <w:pPr>
-        <w:spacing w:after="160"/>
-      </w:pPr>
-      <w:r>
-        <w:t xml:space="preserve">Como a base termina em agosto de 2018 e a receita está estável, usei a média dos três últimos meses para estimar os meses seguintes.</w:t>
+        <w:pStyle w:val="Heading2"/>
+        <w:spacing w:after="120" w:before="240"/>
+      </w:pPr>
+      <w:r>
+        <w:t xml:space="preserve">3.7 Por que a receita parou de crescer em 2018</w:t>
+      </w:r>
+    </w:p>
+    <w:p>
+      <w:pPr>
+        <w:spacing w:after="160"/>
+      </w:pPr>
+      <w:r>
+        <w:t xml:space="preserve">A seção 3.1 mostrou que a receita estacionou em 2018, e essa é a informação mais importante do relatório. Para não deixar isso apenas como constatação, contei quantos vendedores diferentes e quantos clientes diferentes aparecem em cada mês, procurando ver qual dos dois lados parou.</w:t>
       </w:r>
     </w:p>
     <w:p>
@@ -873,7 +881,7 @@
       <w:r>
         <w:drawing>
           <wp:inline distT="0" distB="0" distL="0" distR="0">
-            <wp:extent cx="5429250" cy="2466975"/>
+            <wp:extent cx="5334000" cy="2667000"/>
             <wp:effectExtent t="0" r="0" b="0" l="0"/>
             <wp:docPr id="1" name="" descr="" title=""/>
             <wp:cNvGraphicFramePr>
@@ -898,6 +906,109 @@
                   <pic:spPr bwMode="auto">
                     <a:xfrm>
                       <a:off x="0" y="0"/>
+                      <a:ext cx="5334000" cy="2667000"/>
+                    </a:xfrm>
+                    <a:prstGeom prst="rect">
+                      <a:avLst/>
+                    </a:prstGeom>
+                  </pic:spPr>
+                </pic:pic>
+              </a:graphicData>
+            </a:graphic>
+          </wp:inline>
+        </w:drawing>
+      </w:r>
+    </w:p>
+    <w:p>
+      <w:pPr>
+        <w:spacing w:after="280"/>
+        <w:jc w:val="center"/>
+      </w:pPr>
+      <w:r>
+        <w:rPr>
+          <w:i/>
+          <w:iCs/>
+          <w:color w:val="555555"/>
+          <w:sz w:val="18"/>
+          <w:szCs w:val="18"/>
+        </w:rPr>
+        <w:t xml:space="preserve">Figura 8. Clientes e vendedores ativos por mês.</w:t>
+      </w:r>
+    </w:p>
+    <w:p>
+      <w:pPr>
+        <w:spacing w:after="160"/>
+      </w:pPr>
+      <w:r>
+        <w:t xml:space="preserve">O resultado aponta uma direção clara. Entre janeiro e agosto de 2018 os vendedores ativos subiram de 968 para 1.266, um aumento de 30,8%, e mesmo assim a receita não cresceu. Os clientes caíram de 7.088 para 6.380 no mesmo intervalo, uma queda de 10%.</w:t>
+      </w:r>
+    </w:p>
+    <w:p>
+      <w:pPr>
+        <w:spacing w:after="160"/>
+      </w:pPr>
+      <w:r>
+        <w:t xml:space="preserve">A consequência aparece na receita por vendedor, que caiu de R$ 1.138 para R$ 788, uma queda de 30,8%. A plataforma continuou atraindo quem vende, mas não atraiu quem compra no mesmo ritmo, então o mesmo volume de vendas passou a ser dividido entre mais vendedores.</w:t>
+      </w:r>
+    </w:p>
+    <w:p>
+      <w:pPr>
+        <w:spacing w:after="160"/>
+      </w:pPr>
+      <w:r>
+        <w:t xml:space="preserve">Isso muda a leitura do problema. O gargalo não está na oferta, está na demanda. Continuar recrutando vendedor sem trazer comprador junto tende a piorar o resultado individual de cada um deles.</w:t>
+      </w:r>
+    </w:p>
+    <w:p>
+      <w:pPr>
+        <w:pStyle w:val="Heading1"/>
+        <w:spacing w:after="160" w:before="320"/>
+      </w:pPr>
+      <w:r>
+        <w:t xml:space="preserve">4. Projeção para os próximos meses</w:t>
+      </w:r>
+    </w:p>
+    <w:p>
+      <w:pPr>
+        <w:spacing w:after="160"/>
+      </w:pPr>
+      <w:r>
+        <w:t xml:space="preserve">Como a base termina em agosto de 2018 e a receita está estável, usei a média dos três últimos meses para estimar os meses seguintes.</w:t>
+      </w:r>
+    </w:p>
+    <w:p>
+      <w:pPr>
+        <w:spacing w:after="60" w:before="120"/>
+        <w:jc w:val="center"/>
+      </w:pPr>
+      <w:r>
+        <w:drawing>
+          <wp:inline distT="0" distB="0" distL="0" distR="0">
+            <wp:extent cx="5429250" cy="2466975"/>
+            <wp:effectExtent t="0" r="0" b="0" l="0"/>
+            <wp:docPr id="1" name="" descr="" title=""/>
+            <wp:cNvGraphicFramePr>
+              <a:graphicFrameLocks xmlns:a="http://schemas.openxmlformats.org/drawingml/2006/main" noChangeAspect="1"/>
+            </wp:cNvGraphicFramePr>
+            <a:graphic xmlns:a="http://schemas.openxmlformats.org/drawingml/2006/main">
+              <a:graphicData uri="http://schemas.openxmlformats.org/drawingml/2006/picture">
+                <pic:pic xmlns:pic="http://schemas.openxmlformats.org/drawingml/2006/picture">
+                  <pic:nvPicPr>
+                    <pic:cNvPr id="0" name="" descr=""/>
+                    <pic:cNvPicPr>
+                      <a:picLocks noChangeAspect="1" noChangeArrowheads="1"/>
+                    </pic:cNvPicPr>
+                  </pic:nvPicPr>
+                  <pic:blipFill>
+                    <a:blip r:embed="rId15" cstate="none"/>
+                    <a:srcRect/>
+                    <a:stretch>
+                      <a:fillRect/>
+                    </a:stretch>
+                  </pic:blipFill>
+                  <pic:spPr bwMode="auto">
+                    <a:xfrm>
+                      <a:off x="0" y="0"/>
                       <a:ext cx="5429250" cy="2466975"/>
                     </a:xfrm>
                     <a:prstGeom prst="rect">
@@ -924,7 +1035,7 @@
           <w:sz w:val="18"/>
           <w:szCs w:val="18"/>
         </w:rPr>
-        <w:t xml:space="preserve">Figura 8. Receita mensal e projeção para os três meses seguintes.</w:t>
+        <w:t xml:space="preserve">Figura 9. Receita mensal e projeção para os três meses seguintes.</w:t>
       </w:r>
     </w:p>
     <w:p>
@@ -933,6 +1044,14 @@
       </w:pPr>
       <w:r>
         <w:t xml:space="preserve">A média dos últimos três meses é de R$ 1,02 milhão. Projetando esse valor para setembro, outubro e novembro de 2018, chega-se a cerca de R$ 3,06 milhões no trimestre. Comparando com o mesmo trimestre de 2017, quando a receita foi de R$ 2,65 milhões, seria um crescimento de 15,2%, bem menor que o ritmo que a empresa teve durante 2017.</w:t>
+      </w:r>
+    </w:p>
+    <w:p>
+      <w:pPr>
+        <w:spacing w:after="160"/>
+      </w:pPr>
+      <w:r>
+        <w:t xml:space="preserve">O valor projetado, porém, é o que menos importa aqui. O ponto relevante é que, com os dados disponíveis, a melhor estimativa para os próximos meses é repetir os últimos três. A projeção não aponta retomada nem queda, aponta continuidade, e funciona como a confirmação numérica do platô descrito na seção 3.1.</w:t>
       </w:r>
     </w:p>
     <w:p>
@@ -944,7 +1063,7 @@
           <w:b/>
           <w:bCs/>
         </w:rPr>
-        <w:t xml:space="preserve">Limitações desta projeção:</w:t>
+        <w:t xml:space="preserve">Duas ressalvas que mudam a leitura do número:</w:t>
       </w:r>
     </w:p>
     <w:p>
@@ -957,7 +1076,7 @@
         <w:spacing w:after="100"/>
       </w:pPr>
       <w:r>
-        <w:t xml:space="preserve">Ela só funciona porque a receita está estável. Se ainda estivesse crescendo forte, usar a média dos últimos meses não seria adequado.</w:t>
+        <w:t xml:space="preserve">O método só é válido porque a receita está estável. Se ela ainda estivesse crescendo forte, usar a média dos últimos meses levaria a um resultado errado.</w:t>
       </w:r>
     </w:p>
     <w:p>
@@ -970,7 +1089,52 @@
         <w:spacing w:after="100"/>
       </w:pPr>
       <w:r>
-        <w:t xml:space="preserve">A base termina em agosto de 2018, então não é possível comparar a projeção com o que realmente aconteceu.</w:t>
+        <w:t xml:space="preserve">Novembro tem Black Friday, e a seção 3.2 mostrou o peso dessa data. A média não captura datas promocionais, então novembro provavelmente ficaria acima do projetado.</w:t>
+      </w:r>
+    </w:p>
+    <w:p>
+      <w:pPr>
+        <w:spacing w:after="160"/>
+      </w:pPr>
+      <w:r>
+        <w:t xml:space="preserve">Como a base termina em agosto de 2018, não há como verificar se a projeção se confirmou. Por isso ela deve ser usada como referência de ordem de grandeza, para dimensionar expectativa, e não como meta.</w:t>
+      </w:r>
+    </w:p>
+    <w:p>
+      <w:pPr>
+        <w:pStyle w:val="Heading1"/>
+        <w:spacing w:after="160" w:before="320"/>
+      </w:pPr>
+      <w:r>
+        <w:t xml:space="preserve">5. Conclusões e Recomendações</w:t>
+      </w:r>
+    </w:p>
+    <w:p>
+      <w:pPr>
+        <w:spacing w:after="160"/>
+      </w:pPr>
+      <w:r>
+        <w:t xml:space="preserve">A Olist cresceu muito rápido em 2017, mas os dados de 2018 mostram a receita e o número de pedidos estáveis. O número de 628% de crescimento descreve o primeiro ano da série, não o momento em que a base termina, e projetar esse ritmo para frente seria o erro mais caro que um investidor poderia cometer com esses dados.</w:t>
+      </w:r>
+    </w:p>
+    <w:p>
+      <w:pPr>
+        <w:spacing w:after="160"/>
+      </w:pPr>
+      <w:r>
+        <w:t xml:space="preserve">O motivo da estabilização foi possível rastrear. Durante 2018 a empresa continuou atraindo vendedores, que cresceram 30,8%, enquanto os clientes caíram 10% e a receita por vendedor encolheu 30,8%. O limite do crescimento está do lado da demanda, e não da oferta. Essa é a informação que mais deveria pesar em uma decisão de investimento, porque indica onde o esforço precisa ser direcionado.</w:t>
+      </w:r>
+    </w:p>
+    <w:p>
+      <w:pPr>
+        <w:spacing w:after="120"/>
+      </w:pPr>
+      <w:r>
+        <w:rPr>
+          <w:b/>
+          <w:bCs/>
+        </w:rPr>
+        <w:t xml:space="preserve">Recomendações:</w:t>
       </w:r>
     </w:p>
     <w:p>
@@ -983,7 +1147,7 @@
         <w:spacing w:after="100"/>
       </w:pPr>
       <w:r>
-        <w:t xml:space="preserve">Novembro tem Black Friday, e a seção 3.2 mostrou o peso dessa data. A média não considera isso, então novembro provavelmente ficaria acima do projetado.</w:t>
+        <w:t xml:space="preserve">Priorizar a atração e a retenção de clientes. Foi o lado que parou de crescer em 2018 e é o que trava a receita, então investir em recrutamento de vendedores antes de resolver isso tende a reduzir ainda mais a receita por vendedor.</w:t>
       </w:r>
     </w:p>
     <w:p>
@@ -996,44 +1160,7 @@
         <w:spacing w:after="100"/>
       </w:pPr>
       <w:r>
-        <w:t xml:space="preserve">Qualquer mudança na empresa, como investir mais em divulgação ou entrar em novas regiões, mudaria esse cenário.</w:t>
-      </w:r>
-    </w:p>
-    <w:p>
-      <w:pPr>
-        <w:pStyle w:val="Heading1"/>
-        <w:spacing w:after="160" w:before="320"/>
-      </w:pPr>
-      <w:r>
-        <w:t xml:space="preserve">5. Conclusões e Recomendações</w:t>
-      </w:r>
-    </w:p>
-    <w:p>
-      <w:pPr>
-        <w:spacing w:after="160"/>
-      </w:pPr>
-      <w:r>
-        <w:t xml:space="preserve">A Olist cresceu muito rápido em 2017, mas os dados de 2018 mostram a receita e o número de pedidos estáveis. Somando isso à concentração em poucos estados e a um ticket médio que quase não mudou no período, o que se vê é uma empresa que ganhou escala rapidamente e agora precisa encontrar novas formas de crescer.</w:t>
-      </w:r>
-    </w:p>
-    <w:p>
-      <w:pPr>
-        <w:spacing w:after="160"/>
-      </w:pPr>
-      <w:r>
-        <w:t xml:space="preserve">Para quem for avaliar a empresa, o principal alerta é não projetar o resultado passado para frente sem antes entender por que o ritmo diminuiu.</w:t>
-      </w:r>
-    </w:p>
-    <w:p>
-      <w:pPr>
-        <w:spacing w:after="120"/>
-      </w:pPr>
-      <w:r>
-        <w:rPr>
-          <w:b/>
-          <w:bCs/>
-        </w:rPr>
-        <w:t xml:space="preserve">Recomendações:</w:t>
+        <w:t xml:space="preserve">Crescer fora dos cinco maiores estados. Eles concentram 73,1% da receita, então os outros 22 estados, que hoje somam 26,9%, representam bastante espaço para investir em ação comercial e logística.</w:t>
       </w:r>
     </w:p>
     <w:p>
@@ -1046,7 +1173,7 @@
         <w:spacing w:after="100"/>
       </w:pPr>
       <w:r>
-        <w:t xml:space="preserve">Entender por que a receita parou de crescer em 2018. Vale identificar se é sazonalidade, se o mercado está saturado ou se existe algum problema operacional. É a pergunta mais importante que ficou em aberto.</w:t>
+        <w:t xml:space="preserve">Acompanhar a receita por vendedor como indicador de saúde da plataforma. Ela caiu quase um terço em oito meses, e é o sinal mais direto de que a base de vendedores está crescendo mais rápido que a demanda.</w:t>
       </w:r>
     </w:p>
     <w:p>
@@ -1059,33 +1186,7 @@
         <w:spacing w:after="100"/>
       </w:pPr>
       <w:r>
-        <w:t xml:space="preserve">Crescer fora dos cinco maiores estados. Eles concentram 73% da receita, então os outros 22 estados, que hoje somam 27%, representam bastante espaço para investir em ação comercial e logística.</w:t>
-      </w:r>
-    </w:p>
-    <w:p>
-      <w:pPr>
-        <w:pStyle w:val="ListParagraph"/>
-        <w:numPr>
-          <w:ilvl w:val="0"/>
-          <w:numId w:val="1"/>
-        </w:numPr>
-        <w:spacing w:after="100"/>
-      </w:pPr>
-      <w:r>
         <w:t xml:space="preserve">Trabalhar o valor do pedido. Como o crescimento veio de volume e não de ticket maior, ações como venda casada e frete grátis a partir de um valor mínimo podem aumentar o valor por pedido.</w:t>
-      </w:r>
-    </w:p>
-    <w:p>
-      <w:pPr>
-        <w:pStyle w:val="ListParagraph"/>
-        <w:numPr>
-          <w:ilvl w:val="0"/>
-          <w:numId w:val="1"/>
-        </w:numPr>
-        <w:spacing w:after="100"/>
-      </w:pPr>
-      <w:r>
-        <w:t xml:space="preserve">Apoiar os vendedores de melhor desempenho, com mais suporte e visibilidade, sem criar dependência de poucos fornecedores.</w:t>
       </w:r>
     </w:p>
     <w:p>

</xml_diff>